<commit_message>
Lesson 02: Dynamic Rnder, Dynamic Child Render, Components Comunication, Rest API, Rest API with Biseness logic, Rest API with services
</commit_message>
<xml_diff>
--- a/React_053.docx
+++ b/React_053.docx
@@ -87,7 +87,6 @@
           <w:p>
             <w:pPr>
               <w:rPr>
-                <w:rFonts w:hint="cs"/>
                 <w:rtl/>
                 <w:lang w:val="en-US"/>
               </w:rPr>
@@ -113,7 +112,6 @@
           <w:p>
             <w:pPr>
               <w:rPr>
-                <w:rFonts w:hint="cs"/>
                 <w:rtl/>
                 <w:lang w:val="en-US"/>
               </w:rPr>
@@ -272,27 +270,11 @@
                 <w:lang w:val="en-US"/>
               </w:rPr>
             </w:pPr>
-            <w:proofErr w:type="spellStart"/>
-            <w:proofErr w:type="gramStart"/>
-            <w:r>
-              <w:rPr>
-                <w:lang w:val="en-US"/>
-              </w:rPr>
-              <w:t>useState</w:t>
-            </w:r>
-            <w:proofErr w:type="spellEnd"/>
-            <w:r>
-              <w:rPr>
-                <w:lang w:val="en-US"/>
-              </w:rPr>
-              <w:t>(</w:t>
-            </w:r>
-            <w:proofErr w:type="gramEnd"/>
-            <w:r>
-              <w:rPr>
-                <w:lang w:val="en-US"/>
-              </w:rPr>
-              <w:t>)</w:t>
+            <w:r>
+              <w:rPr>
+                <w:lang w:val="en-US"/>
+              </w:rPr>
+              <w:t>useState()</w:t>
             </w:r>
           </w:p>
         </w:tc>
@@ -400,6 +382,282 @@
     </w:tbl>
     <w:p>
       <w:pPr>
+        <w:rPr>
+          <w:lang w:val="en-US"/>
+        </w:rPr>
+      </w:pPr>
+    </w:p>
+    <w:p>
+      <w:pPr>
+        <w:jc w:val="center"/>
+        <w:rPr>
+          <w:lang w:val="en-US"/>
+        </w:rPr>
+      </w:pPr>
+      <w:r>
+        <w:rPr>
+          <w:lang w:val="en-US"/>
+        </w:rPr>
+        <w:t>Lesson 0</w:t>
+      </w:r>
+      <w:r>
+        <w:rPr>
+          <w:lang w:val="en-US"/>
+        </w:rPr>
+        <w:t>2</w:t>
+      </w:r>
+    </w:p>
+    <w:p>
+      <w:pPr>
+        <w:jc w:val="center"/>
+        <w:rPr>
+          <w:lang w:val="en-US"/>
+        </w:rPr>
+      </w:pPr>
+    </w:p>
+    <w:tbl>
+      <w:tblPr>
+        <w:tblStyle w:val="TableGrid"/>
+        <w:tblW w:w="0" w:type="auto"/>
+        <w:tblLook w:val="04A0" w:firstRow="1" w:lastRow="0" w:firstColumn="1" w:lastColumn="0" w:noHBand="0" w:noVBand="1"/>
+      </w:tblPr>
+      <w:tblGrid>
+        <w:gridCol w:w="2614"/>
+        <w:gridCol w:w="2614"/>
+        <w:gridCol w:w="2614"/>
+        <w:gridCol w:w="2614"/>
+      </w:tblGrid>
+      <w:tr>
+        <w:tc>
+          <w:tcPr>
+            <w:tcW w:w="2614" w:type="dxa"/>
+          </w:tcPr>
+          <w:p>
+            <w:pPr>
+              <w:rPr>
+                <w:lang w:val="en-US"/>
+              </w:rPr>
+            </w:pPr>
+            <w:r>
+              <w:rPr>
+                <w:lang w:val="en-US"/>
+              </w:rPr>
+              <w:t>Time</w:t>
+            </w:r>
+          </w:p>
+        </w:tc>
+        <w:tc>
+          <w:tcPr>
+            <w:tcW w:w="2614" w:type="dxa"/>
+          </w:tcPr>
+          <w:p>
+            <w:pPr>
+              <w:rPr>
+                <w:lang w:val="en-US"/>
+              </w:rPr>
+            </w:pPr>
+            <w:r>
+              <w:rPr>
+                <w:lang w:val="en-US"/>
+              </w:rPr>
+              <w:t>Concept</w:t>
+            </w:r>
+          </w:p>
+        </w:tc>
+        <w:tc>
+          <w:tcPr>
+            <w:tcW w:w="2614" w:type="dxa"/>
+          </w:tcPr>
+          <w:p>
+            <w:pPr>
+              <w:rPr>
+                <w:lang w:val="en-US"/>
+              </w:rPr>
+            </w:pPr>
+            <w:r>
+              <w:rPr>
+                <w:lang w:val="en-US"/>
+              </w:rPr>
+              <w:t>E</w:t>
+            </w:r>
+            <w:r>
+              <w:rPr>
+                <w:lang w:val="en-US"/>
+              </w:rPr>
+              <w:t>xplanation</w:t>
+            </w:r>
+          </w:p>
+        </w:tc>
+        <w:tc>
+          <w:tcPr>
+            <w:tcW w:w="2614" w:type="dxa"/>
+          </w:tcPr>
+          <w:p>
+            <w:pPr>
+              <w:ind w:firstLine="720"/>
+              <w:rPr>
+                <w:lang w:val="en-US"/>
+              </w:rPr>
+            </w:pPr>
+            <w:r>
+              <w:rPr>
+                <w:lang w:val="en-US"/>
+              </w:rPr>
+              <w:t>Example</w:t>
+            </w:r>
+          </w:p>
+        </w:tc>
+      </w:tr>
+      <w:tr>
+        <w:tc>
+          <w:tcPr>
+            <w:tcW w:w="2614" w:type="dxa"/>
+          </w:tcPr>
+          <w:p>
+            <w:pPr>
+              <w:rPr>
+                <w:lang w:val="en-US"/>
+              </w:rPr>
+            </w:pPr>
+          </w:p>
+        </w:tc>
+        <w:tc>
+          <w:tcPr>
+            <w:tcW w:w="2614" w:type="dxa"/>
+          </w:tcPr>
+          <w:p>
+            <w:pPr>
+              <w:rPr>
+                <w:lang w:val="en-US"/>
+              </w:rPr>
+            </w:pPr>
+            <w:r>
+              <w:rPr>
+                <w:lang w:val="en-US"/>
+              </w:rPr>
+              <w:t>? :</w:t>
+            </w:r>
+          </w:p>
+        </w:tc>
+        <w:tc>
+          <w:tcPr>
+            <w:tcW w:w="2614" w:type="dxa"/>
+          </w:tcPr>
+          <w:p>
+            <w:pPr>
+              <w:rPr>
+                <w:lang w:val="en-US"/>
+              </w:rPr>
+            </w:pPr>
+            <w:r>
+              <w:t> (ternary) operator</w:t>
+            </w:r>
+          </w:p>
+        </w:tc>
+        <w:tc>
+          <w:tcPr>
+            <w:tcW w:w="2614" w:type="dxa"/>
+          </w:tcPr>
+          <w:p>
+            <w:pPr>
+              <w:rPr>
+                <w:lang w:val="en-US"/>
+              </w:rPr>
+            </w:pPr>
+            <w:r>
+              <w:rPr>
+                <w:lang w:val="en-US"/>
+              </w:rPr>
+              <w:t xml:space="preserve">isRed ? </w:t>
+            </w:r>
+            <w:r>
+              <w:rPr>
+                <w:lang w:val="en-US"/>
+              </w:rPr>
+              <w:t>isGreen</w:t>
+            </w:r>
+            <w:r>
+              <w:rPr>
+                <w:lang w:val="en-US"/>
+              </w:rPr>
+              <w:t xml:space="preserve"> : is</w:t>
+            </w:r>
+            <w:r>
+              <w:rPr>
+                <w:lang w:val="en-US"/>
+              </w:rPr>
+              <w:t>Red</w:t>
+            </w:r>
+            <w:r>
+              <w:rPr>
+                <w:lang w:val="en-US"/>
+              </w:rPr>
+              <w:t xml:space="preserve"> </w:t>
+            </w:r>
+          </w:p>
+        </w:tc>
+      </w:tr>
+      <w:tr>
+        <w:tc>
+          <w:tcPr>
+            <w:tcW w:w="2614" w:type="dxa"/>
+          </w:tcPr>
+          <w:p>
+            <w:pPr>
+              <w:rPr>
+                <w:lang w:val="en-US"/>
+              </w:rPr>
+            </w:pPr>
+          </w:p>
+        </w:tc>
+        <w:tc>
+          <w:tcPr>
+            <w:tcW w:w="2614" w:type="dxa"/>
+          </w:tcPr>
+          <w:p>
+            <w:pPr>
+              <w:rPr>
+                <w:lang w:val="en-US"/>
+              </w:rPr>
+            </w:pPr>
+          </w:p>
+        </w:tc>
+        <w:tc>
+          <w:tcPr>
+            <w:tcW w:w="2614" w:type="dxa"/>
+          </w:tcPr>
+          <w:p>
+            <w:pPr>
+              <w:rPr>
+                <w:lang w:val="en-US"/>
+              </w:rPr>
+            </w:pPr>
+          </w:p>
+        </w:tc>
+        <w:tc>
+          <w:tcPr>
+            <w:tcW w:w="2614" w:type="dxa"/>
+          </w:tcPr>
+          <w:p>
+            <w:pPr>
+              <w:rPr>
+                <w:lang w:val="en-US"/>
+              </w:rPr>
+            </w:pPr>
+          </w:p>
+        </w:tc>
+      </w:tr>
+    </w:tbl>
+    <w:p>
+      <w:pPr>
+        <w:rPr>
+          <w:lang w:val="en-US"/>
+        </w:rPr>
+      </w:pPr>
+    </w:p>
+    <w:p>
+      <w:pPr>
+        <w:jc w:val="center"/>
         <w:rPr>
           <w:lang w:val="en-US"/>
         </w:rPr>
@@ -815,6 +1073,7 @@
   <w:style w:type="paragraph" w:default="1" w:styleId="Normal">
     <w:name w:val="Normal"/>
     <w:qFormat/>
+    <w:rsid w:val="00652DE1"/>
   </w:style>
   <w:style w:type="paragraph" w:styleId="Heading1">
     <w:name w:val="heading 1"/>
@@ -1018,7 +1277,6 @@
   <w:style w:type="character" w:default="1" w:styleId="DefaultParagraphFont">
     <w:name w:val="Default Paragraph Font"/>
     <w:uiPriority w:val="1"/>
-    <w:semiHidden/>
     <w:unhideWhenUsed/>
   </w:style>
   <w:style w:type="table" w:default="1" w:styleId="TableNormal">

</xml_diff>

<commit_message>
Lesson - 5: firebase + redox
</commit_message>
<xml_diff>
--- a/React_053.docx
+++ b/React_053.docx
@@ -3678,19 +3678,7 @@
               <w:rPr>
                 <w:lang w:val="en-US"/>
               </w:rPr>
-              <w:t>Passing</w:t>
-            </w:r>
-            <w:r>
-              <w:rPr>
-                <w:lang w:val="en-US"/>
-              </w:rPr>
-              <w:t xml:space="preserve"> params (id)</w:t>
-            </w:r>
-            <w:r>
-              <w:rPr>
-                <w:lang w:val="en-US"/>
-              </w:rPr>
-              <w:t xml:space="preserve"> on URL</w:t>
+              <w:t>Passing params (id) on URL</w:t>
             </w:r>
           </w:p>
           <w:p>
@@ -5158,33 +5146,7 @@
                 <w:highlight w:val="yellow"/>
                 <w:lang w:val="en-US"/>
               </w:rPr>
-              <w:t xml:space="preserve"> i </w:t>
-            </w:r>
-            <w:r>
-              <w:rPr>
-                <w:b/>
-                <w:bCs/>
-                <w:i/>
-                <w:iCs/>
-                <w:sz w:val="36"/>
-                <w:szCs w:val="36"/>
-                <w:highlight w:val="yellow"/>
-                <w:lang w:val="en-US"/>
-              </w:rPr>
-              <w:t>react-</w:t>
-            </w:r>
-            <w:r>
-              <w:rPr>
-                <w:b/>
-                <w:bCs/>
-                <w:i/>
-                <w:iCs/>
-                <w:sz w:val="36"/>
-                <w:szCs w:val="36"/>
-                <w:highlight w:val="yellow"/>
-                <w:lang w:val="en-US"/>
-              </w:rPr>
-              <w:t>redux</w:t>
+              <w:t xml:space="preserve"> i react-redux</w:t>
             </w:r>
           </w:p>
         </w:tc>
@@ -6334,6 +6296,486 @@
     </w:tbl>
     <w:p>
       <w:pPr>
+        <w:rPr>
+          <w:b/>
+          <w:bCs/>
+          <w:rtl/>
+          <w:lang w:val="en-US"/>
+        </w:rPr>
+      </w:pPr>
+    </w:p>
+    <w:p>
+      <w:pPr>
+        <w:rPr>
+          <w:b/>
+          <w:bCs/>
+          <w:rtl/>
+          <w:lang w:val="en-US"/>
+        </w:rPr>
+      </w:pPr>
+    </w:p>
+    <w:p>
+      <w:pPr>
+        <w:jc w:val="center"/>
+        <w:rPr>
+          <w:b/>
+          <w:bCs/>
+          <w:rtl/>
+          <w:lang w:val="en-US"/>
+        </w:rPr>
+      </w:pPr>
+    </w:p>
+    <w:p>
+      <w:pPr>
+        <w:jc w:val="center"/>
+        <w:rPr>
+          <w:b/>
+          <w:bCs/>
+          <w:rtl/>
+          <w:lang w:val="en-US"/>
+        </w:rPr>
+      </w:pPr>
+    </w:p>
+    <w:p>
+      <w:pPr>
+        <w:jc w:val="center"/>
+        <w:rPr>
+          <w:b/>
+          <w:bCs/>
+          <w:rtl/>
+          <w:lang w:val="en-US"/>
+        </w:rPr>
+      </w:pPr>
+    </w:p>
+    <w:p>
+      <w:pPr>
+        <w:jc w:val="center"/>
+        <w:rPr>
+          <w:b/>
+          <w:bCs/>
+          <w:rtl/>
+          <w:lang w:val="en-US"/>
+        </w:rPr>
+      </w:pPr>
+    </w:p>
+    <w:p>
+      <w:pPr>
+        <w:jc w:val="center"/>
+        <w:rPr>
+          <w:b/>
+          <w:bCs/>
+          <w:lang w:val="en-US"/>
+        </w:rPr>
+      </w:pPr>
+      <w:r>
+        <w:rPr>
+          <w:b/>
+          <w:bCs/>
+          <w:lang w:val="en-US"/>
+        </w:rPr>
+        <w:lastRenderedPageBreak/>
+        <w:t>Lesson – 05</w:t>
+      </w:r>
+    </w:p>
+    <w:tbl>
+      <w:tblPr>
+        <w:tblStyle w:val="TableGrid"/>
+        <w:tblW w:w="0" w:type="auto"/>
+        <w:tblLook w:val="04A0" w:firstRow="1" w:lastRow="0" w:firstColumn="1" w:lastColumn="0" w:noHBand="0" w:noVBand="1"/>
+      </w:tblPr>
+      <w:tblGrid>
+        <w:gridCol w:w="1784"/>
+        <w:gridCol w:w="2214"/>
+        <w:gridCol w:w="2410"/>
+        <w:gridCol w:w="8980"/>
+      </w:tblGrid>
+      <w:tr>
+        <w:tc>
+          <w:tcPr>
+            <w:tcW w:w="1784" w:type="dxa"/>
+          </w:tcPr>
+          <w:p>
+            <w:pPr>
+              <w:jc w:val="center"/>
+              <w:rPr>
+                <w:b/>
+                <w:bCs/>
+                <w:lang w:val="en-US"/>
+              </w:rPr>
+            </w:pPr>
+            <w:r>
+              <w:rPr>
+                <w:lang w:val="en-US"/>
+              </w:rPr>
+              <w:t>Time</w:t>
+            </w:r>
+          </w:p>
+        </w:tc>
+        <w:tc>
+          <w:tcPr>
+            <w:tcW w:w="2214" w:type="dxa"/>
+          </w:tcPr>
+          <w:p>
+            <w:pPr>
+              <w:rPr>
+                <w:b/>
+                <w:bCs/>
+                <w:lang w:val="en-US"/>
+              </w:rPr>
+            </w:pPr>
+            <w:r>
+              <w:rPr>
+                <w:lang w:val="en-US"/>
+              </w:rPr>
+              <w:t>Concept</w:t>
+            </w:r>
+          </w:p>
+        </w:tc>
+        <w:tc>
+          <w:tcPr>
+            <w:tcW w:w="2410" w:type="dxa"/>
+          </w:tcPr>
+          <w:p>
+            <w:pPr>
+              <w:rPr>
+                <w:b/>
+                <w:bCs/>
+                <w:lang w:val="en-US"/>
+              </w:rPr>
+            </w:pPr>
+            <w:r>
+              <w:rPr>
+                <w:lang w:val="en-US"/>
+              </w:rPr>
+              <w:t>E</w:t>
+            </w:r>
+            <w:r>
+              <w:rPr>
+                <w:lang w:val="en-US"/>
+              </w:rPr>
+              <w:t>xplanation</w:t>
+            </w:r>
+          </w:p>
+        </w:tc>
+        <w:tc>
+          <w:tcPr>
+            <w:tcW w:w="8980" w:type="dxa"/>
+          </w:tcPr>
+          <w:p>
+            <w:pPr>
+              <w:jc w:val="center"/>
+              <w:rPr>
+                <w:b/>
+                <w:bCs/>
+                <w:lang w:val="en-US"/>
+              </w:rPr>
+            </w:pPr>
+            <w:r>
+              <w:rPr>
+                <w:lang w:val="en-US"/>
+              </w:rPr>
+              <w:t>Example</w:t>
+            </w:r>
+          </w:p>
+        </w:tc>
+      </w:tr>
+      <w:tr>
+        <w:tc>
+          <w:tcPr>
+            <w:tcW w:w="1784" w:type="dxa"/>
+          </w:tcPr>
+          <w:p>
+            <w:pPr>
+              <w:jc w:val="center"/>
+              <w:rPr>
+                <w:lang w:val="en-US"/>
+              </w:rPr>
+            </w:pPr>
+            <w:r>
+              <w:rPr>
+                <w:lang w:val="en-US"/>
+              </w:rPr>
+              <w:t>19:07</w:t>
+            </w:r>
+          </w:p>
+        </w:tc>
+        <w:tc>
+          <w:tcPr>
+            <w:tcW w:w="2214" w:type="dxa"/>
+          </w:tcPr>
+          <w:p>
+            <w:pPr>
+              <w:rPr>
+                <w:lang w:val="en-US"/>
+              </w:rPr>
+            </w:pPr>
+            <w:r>
+              <w:rPr>
+                <w:lang w:val="en-US"/>
+              </w:rPr>
+              <w:t>Serverless</w:t>
+            </w:r>
+          </w:p>
+        </w:tc>
+        <w:tc>
+          <w:tcPr>
+            <w:tcW w:w="2410" w:type="dxa"/>
+          </w:tcPr>
+          <w:p>
+            <w:pPr>
+              <w:rPr>
+                <w:lang w:val="en-US"/>
+              </w:rPr>
+            </w:pPr>
+            <w:r>
+              <w:rPr>
+                <w:lang w:val="en-US"/>
+              </w:rPr>
+              <w:t xml:space="preserve">No </w:t>
+            </w:r>
+            <w:proofErr w:type="gramStart"/>
+            <w:r>
+              <w:rPr>
+                <w:lang w:val="en-US"/>
+              </w:rPr>
+              <w:t>need</w:t>
+            </w:r>
+            <w:proofErr w:type="gramEnd"/>
+            <w:r>
+              <w:rPr>
+                <w:lang w:val="en-US"/>
+              </w:rPr>
+              <w:t xml:space="preserve"> a Backend developing</w:t>
+            </w:r>
+          </w:p>
+        </w:tc>
+        <w:tc>
+          <w:tcPr>
+            <w:tcW w:w="8980" w:type="dxa"/>
+          </w:tcPr>
+          <w:p>
+            <w:pPr>
+              <w:rPr>
+                <w:lang w:val="en-US"/>
+              </w:rPr>
+            </w:pPr>
+            <w:r>
+              <w:rPr>
+                <w:lang w:val="en-US"/>
+              </w:rPr>
+              <w:t>Firebase</w:t>
+            </w:r>
+          </w:p>
+        </w:tc>
+      </w:tr>
+      <w:tr>
+        <w:tc>
+          <w:tcPr>
+            <w:tcW w:w="1784" w:type="dxa"/>
+          </w:tcPr>
+          <w:p>
+            <w:pPr>
+              <w:jc w:val="center"/>
+              <w:rPr>
+                <w:lang w:val="en-US"/>
+              </w:rPr>
+            </w:pPr>
+          </w:p>
+        </w:tc>
+        <w:tc>
+          <w:tcPr>
+            <w:tcW w:w="2214" w:type="dxa"/>
+          </w:tcPr>
+          <w:p>
+            <w:pPr>
+              <w:rPr>
+                <w:lang w:val="en-US"/>
+              </w:rPr>
+            </w:pPr>
+          </w:p>
+        </w:tc>
+        <w:tc>
+          <w:tcPr>
+            <w:tcW w:w="2410" w:type="dxa"/>
+          </w:tcPr>
+          <w:p>
+            <w:pPr>
+              <w:rPr>
+                <w:lang w:val="en-US"/>
+              </w:rPr>
+            </w:pPr>
+          </w:p>
+        </w:tc>
+        <w:tc>
+          <w:tcPr>
+            <w:tcW w:w="8980" w:type="dxa"/>
+          </w:tcPr>
+          <w:p>
+            <w:pPr>
+              <w:rPr>
+                <w:lang w:val="en-US"/>
+              </w:rPr>
+            </w:pPr>
+          </w:p>
+        </w:tc>
+      </w:tr>
+      <w:tr>
+        <w:tc>
+          <w:tcPr>
+            <w:tcW w:w="1784" w:type="dxa"/>
+          </w:tcPr>
+          <w:p>
+            <w:pPr>
+              <w:jc w:val="center"/>
+              <w:rPr>
+                <w:lang w:val="en-US"/>
+              </w:rPr>
+            </w:pPr>
+          </w:p>
+        </w:tc>
+        <w:tc>
+          <w:tcPr>
+            <w:tcW w:w="2214" w:type="dxa"/>
+          </w:tcPr>
+          <w:p>
+            <w:pPr>
+              <w:rPr>
+                <w:lang w:val="en-US"/>
+              </w:rPr>
+            </w:pPr>
+          </w:p>
+        </w:tc>
+        <w:tc>
+          <w:tcPr>
+            <w:tcW w:w="2410" w:type="dxa"/>
+          </w:tcPr>
+          <w:p>
+            <w:pPr>
+              <w:rPr>
+                <w:lang w:val="en-US"/>
+              </w:rPr>
+            </w:pPr>
+          </w:p>
+        </w:tc>
+        <w:tc>
+          <w:tcPr>
+            <w:tcW w:w="8980" w:type="dxa"/>
+          </w:tcPr>
+          <w:p>
+            <w:pPr>
+              <w:rPr>
+                <w:lang w:val="en-US"/>
+              </w:rPr>
+            </w:pPr>
+          </w:p>
+        </w:tc>
+      </w:tr>
+      <w:tr>
+        <w:tc>
+          <w:tcPr>
+            <w:tcW w:w="1784" w:type="dxa"/>
+          </w:tcPr>
+          <w:p>
+            <w:pPr>
+              <w:jc w:val="center"/>
+              <w:rPr>
+                <w:lang w:val="en-US"/>
+              </w:rPr>
+            </w:pPr>
+          </w:p>
+        </w:tc>
+        <w:tc>
+          <w:tcPr>
+            <w:tcW w:w="2214" w:type="dxa"/>
+          </w:tcPr>
+          <w:p>
+            <w:pPr>
+              <w:rPr>
+                <w:lang w:val="en-US"/>
+              </w:rPr>
+            </w:pPr>
+          </w:p>
+        </w:tc>
+        <w:tc>
+          <w:tcPr>
+            <w:tcW w:w="2410" w:type="dxa"/>
+          </w:tcPr>
+          <w:p>
+            <w:pPr>
+              <w:rPr>
+                <w:lang w:val="en-US"/>
+              </w:rPr>
+            </w:pPr>
+          </w:p>
+        </w:tc>
+        <w:tc>
+          <w:tcPr>
+            <w:tcW w:w="8980" w:type="dxa"/>
+          </w:tcPr>
+          <w:p>
+            <w:pPr>
+              <w:rPr>
+                <w:lang w:val="en-US"/>
+              </w:rPr>
+            </w:pPr>
+          </w:p>
+        </w:tc>
+      </w:tr>
+      <w:tr>
+        <w:tc>
+          <w:tcPr>
+            <w:tcW w:w="1784" w:type="dxa"/>
+          </w:tcPr>
+          <w:p>
+            <w:pPr>
+              <w:jc w:val="center"/>
+              <w:rPr>
+                <w:lang w:val="en-US"/>
+              </w:rPr>
+            </w:pPr>
+          </w:p>
+        </w:tc>
+        <w:tc>
+          <w:tcPr>
+            <w:tcW w:w="2214" w:type="dxa"/>
+          </w:tcPr>
+          <w:p>
+            <w:pPr>
+              <w:rPr>
+                <w:lang w:val="en-US"/>
+              </w:rPr>
+            </w:pPr>
+          </w:p>
+        </w:tc>
+        <w:tc>
+          <w:tcPr>
+            <w:tcW w:w="2410" w:type="dxa"/>
+          </w:tcPr>
+          <w:p>
+            <w:pPr>
+              <w:rPr>
+                <w:lang w:val="en-US"/>
+              </w:rPr>
+            </w:pPr>
+          </w:p>
+        </w:tc>
+        <w:tc>
+          <w:tcPr>
+            <w:tcW w:w="8980" w:type="dxa"/>
+          </w:tcPr>
+          <w:p>
+            <w:pPr>
+              <w:rPr>
+                <w:lang w:val="en-US"/>
+              </w:rPr>
+            </w:pPr>
+          </w:p>
+        </w:tc>
+      </w:tr>
+    </w:tbl>
+    <w:p>
+      <w:pPr>
+        <w:jc w:val="center"/>
         <w:rPr>
           <w:b/>
           <w:bCs/>
@@ -6963,7 +7405,7 @@
   <w:style w:type="paragraph" w:default="1" w:styleId="Normal">
     <w:name w:val="Normal"/>
     <w:qFormat/>
-    <w:rsid w:val="004333B1"/>
+    <w:rsid w:val="00F11877"/>
   </w:style>
   <w:style w:type="paragraph" w:styleId="Heading1">
     <w:name w:val="heading 1"/>

</xml_diff>

<commit_message>
lesson-06 + Exercises 8+9+10+11 םכ Rקשבא
</commit_message>
<xml_diff>
--- a/React_053.docx
+++ b/React_053.docx
@@ -2707,7 +2707,7 @@
               <w:rPr>
                 <w:lang w:val="en-US"/>
               </w:rPr>
-              <w:t>Time</w:t>
+              <w:t>C</w:t>
             </w:r>
           </w:p>
         </w:tc>
@@ -6767,6 +6767,1311 @@
             <w:pPr>
               <w:rPr>
                 <w:lang w:val="en-US"/>
+              </w:rPr>
+            </w:pPr>
+          </w:p>
+        </w:tc>
+      </w:tr>
+    </w:tbl>
+    <w:p>
+      <w:pPr>
+        <w:jc w:val="center"/>
+        <w:rPr>
+          <w:b/>
+          <w:bCs/>
+          <w:lang w:val="en-US"/>
+        </w:rPr>
+      </w:pPr>
+    </w:p>
+    <w:p>
+      <w:pPr>
+        <w:jc w:val="center"/>
+        <w:rPr>
+          <w:b/>
+          <w:bCs/>
+          <w:lang w:val="en-US"/>
+        </w:rPr>
+      </w:pPr>
+      <w:r>
+        <w:rPr>
+          <w:b/>
+          <w:bCs/>
+          <w:lang w:val="en-US"/>
+        </w:rPr>
+        <w:t>LESSON – 06</w:t>
+      </w:r>
+    </w:p>
+    <w:tbl>
+      <w:tblPr>
+        <w:tblStyle w:val="TableGrid"/>
+        <w:tblW w:w="0" w:type="auto"/>
+        <w:tblLook w:val="04A0" w:firstRow="1" w:lastRow="0" w:firstColumn="1" w:lastColumn="0" w:noHBand="0" w:noVBand="1"/>
+      </w:tblPr>
+      <w:tblGrid>
+        <w:gridCol w:w="1581"/>
+        <w:gridCol w:w="2055"/>
+        <w:gridCol w:w="2296"/>
+        <w:gridCol w:w="9456"/>
+      </w:tblGrid>
+      <w:tr>
+        <w:tc>
+          <w:tcPr>
+            <w:tcW w:w="1784" w:type="dxa"/>
+          </w:tcPr>
+          <w:p>
+            <w:pPr>
+              <w:jc w:val="center"/>
+              <w:rPr>
+                <w:b/>
+                <w:bCs/>
+                <w:lang w:val="en-US"/>
+              </w:rPr>
+            </w:pPr>
+            <w:r>
+              <w:rPr>
+                <w:lang w:val="en-US"/>
+              </w:rPr>
+              <w:t>Time</w:t>
+            </w:r>
+          </w:p>
+        </w:tc>
+        <w:tc>
+          <w:tcPr>
+            <w:tcW w:w="2214" w:type="dxa"/>
+          </w:tcPr>
+          <w:p>
+            <w:pPr>
+              <w:rPr>
+                <w:b/>
+                <w:bCs/>
+                <w:lang w:val="en-US"/>
+              </w:rPr>
+            </w:pPr>
+            <w:r>
+              <w:rPr>
+                <w:lang w:val="en-US"/>
+              </w:rPr>
+              <w:t>Concept</w:t>
+            </w:r>
+          </w:p>
+        </w:tc>
+        <w:tc>
+          <w:tcPr>
+            <w:tcW w:w="2410" w:type="dxa"/>
+          </w:tcPr>
+          <w:p>
+            <w:pPr>
+              <w:rPr>
+                <w:b/>
+                <w:bCs/>
+                <w:lang w:val="en-US"/>
+              </w:rPr>
+            </w:pPr>
+            <w:r>
+              <w:rPr>
+                <w:lang w:val="en-US"/>
+              </w:rPr>
+              <w:t>E</w:t>
+            </w:r>
+            <w:r>
+              <w:rPr>
+                <w:lang w:val="en-US"/>
+              </w:rPr>
+              <w:t>xplanation</w:t>
+            </w:r>
+          </w:p>
+        </w:tc>
+        <w:tc>
+          <w:tcPr>
+            <w:tcW w:w="8980" w:type="dxa"/>
+          </w:tcPr>
+          <w:p>
+            <w:pPr>
+              <w:jc w:val="center"/>
+              <w:rPr>
+                <w:b/>
+                <w:bCs/>
+                <w:lang w:val="en-US"/>
+              </w:rPr>
+            </w:pPr>
+            <w:r>
+              <w:rPr>
+                <w:lang w:val="en-US"/>
+              </w:rPr>
+              <w:t>Example</w:t>
+            </w:r>
+          </w:p>
+        </w:tc>
+      </w:tr>
+      <w:tr>
+        <w:tc>
+          <w:tcPr>
+            <w:tcW w:w="1784" w:type="dxa"/>
+          </w:tcPr>
+          <w:p>
+            <w:pPr>
+              <w:jc w:val="center"/>
+              <w:rPr>
+                <w:lang w:val="en-US"/>
+              </w:rPr>
+            </w:pPr>
+          </w:p>
+        </w:tc>
+        <w:tc>
+          <w:tcPr>
+            <w:tcW w:w="2214" w:type="dxa"/>
+          </w:tcPr>
+          <w:p>
+            <w:pPr>
+              <w:rPr>
+                <w:lang w:val="en-US"/>
+              </w:rPr>
+            </w:pPr>
+            <w:r>
+              <w:rPr>
+                <w:lang w:val="en-US"/>
+              </w:rPr>
+              <w:t>Memo</w:t>
+            </w:r>
+          </w:p>
+        </w:tc>
+        <w:tc>
+          <w:tcPr>
+            <w:tcW w:w="2410" w:type="dxa"/>
+          </w:tcPr>
+          <w:p>
+            <w:pPr>
+              <w:rPr>
+                <w:lang w:val="en-US"/>
+              </w:rPr>
+            </w:pPr>
+            <w:proofErr w:type="spellStart"/>
+            <w:r>
+              <w:rPr>
+                <w:lang w:val="en-US"/>
+              </w:rPr>
+              <w:t>Rerendering</w:t>
+            </w:r>
+            <w:proofErr w:type="spellEnd"/>
+            <w:r>
+              <w:rPr>
+                <w:lang w:val="en-US"/>
+              </w:rPr>
+              <w:t xml:space="preserve"> stoper –</w:t>
+            </w:r>
+          </w:p>
+          <w:p>
+            <w:pPr>
+              <w:rPr>
+                <w:lang w:val="en-US"/>
+              </w:rPr>
+            </w:pPr>
+            <w:r>
+              <w:rPr>
+                <w:lang w:val="en-US"/>
+              </w:rPr>
+              <w:t xml:space="preserve">If I do not need </w:t>
+            </w:r>
+            <w:proofErr w:type="spellStart"/>
+            <w:r>
+              <w:rPr>
+                <w:lang w:val="en-US"/>
+              </w:rPr>
+              <w:t>ReRender</w:t>
+            </w:r>
+            <w:proofErr w:type="spellEnd"/>
+            <w:r>
+              <w:rPr>
+                <w:lang w:val="en-US"/>
+              </w:rPr>
+              <w:t xml:space="preserve"> of the child component </w:t>
+            </w:r>
+          </w:p>
+          <w:p>
+            <w:pPr>
+              <w:rPr>
+                <w:lang w:val="en-US"/>
+              </w:rPr>
+            </w:pPr>
+            <w:r>
+              <w:rPr>
+                <w:lang w:val="en-US"/>
+              </w:rPr>
+              <w:t xml:space="preserve">Setet on the component who do not need to be </w:t>
+            </w:r>
+            <w:proofErr w:type="spellStart"/>
+            <w:r>
+              <w:rPr>
+                <w:lang w:val="en-US"/>
+              </w:rPr>
+              <w:t>ReRendered</w:t>
+            </w:r>
+            <w:proofErr w:type="spellEnd"/>
+          </w:p>
+          <w:p>
+            <w:pPr>
+              <w:bidi/>
+              <w:rPr>
+                <w:rtl/>
+                <w:lang w:val="en-US"/>
+              </w:rPr>
+            </w:pPr>
+            <w:r>
+              <w:rPr>
+                <w:rFonts w:hint="cs"/>
+                <w:rtl/>
+                <w:lang w:val="en-US"/>
+              </w:rPr>
+              <w:t xml:space="preserve">מיועד למניעת </w:t>
+            </w:r>
+            <w:proofErr w:type="spellStart"/>
+            <w:r>
+              <w:rPr>
+                <w:rFonts w:hint="cs"/>
+                <w:rtl/>
+                <w:lang w:val="en-US"/>
+              </w:rPr>
+              <w:t>רנדור</w:t>
+            </w:r>
+            <w:proofErr w:type="spellEnd"/>
+            <w:r>
+              <w:rPr>
+                <w:rFonts w:hint="cs"/>
+                <w:rtl/>
+                <w:lang w:val="en-US"/>
+              </w:rPr>
+              <w:t xml:space="preserve"> מחדש של </w:t>
+            </w:r>
+            <w:proofErr w:type="spellStart"/>
+            <w:r>
+              <w:rPr>
+                <w:rFonts w:hint="cs"/>
+                <w:rtl/>
+                <w:lang w:val="en-US"/>
+              </w:rPr>
+              <w:t>הקומפוננטנ</w:t>
+            </w:r>
+            <w:proofErr w:type="spellEnd"/>
+          </w:p>
+        </w:tc>
+        <w:tc>
+          <w:tcPr>
+            <w:tcW w:w="8980" w:type="dxa"/>
+          </w:tcPr>
+          <w:p>
+            <w:pPr>
+              <w:jc w:val="center"/>
+              <w:rPr>
+                <w:lang w:val="en-US"/>
+              </w:rPr>
+            </w:pPr>
+            <w:r>
+              <w:rPr>
+                <w:noProof/>
+              </w:rPr>
+              <w:drawing>
+                <wp:inline distT="0" distB="0" distL="0" distR="0" wp14:anchorId="65472204" wp14:editId="1099673E">
+                  <wp:extent cx="5123167" cy="1439522"/>
+                  <wp:effectExtent l="114300" t="114300" r="135255" b="142240"/>
+                  <wp:docPr id="810415773" name="Picture 1"/>
+                  <wp:cNvGraphicFramePr>
+                    <a:graphicFrameLocks xmlns:a="http://schemas.openxmlformats.org/drawingml/2006/main" noChangeAspect="1"/>
+                  </wp:cNvGraphicFramePr>
+                  <a:graphic xmlns:a="http://schemas.openxmlformats.org/drawingml/2006/main">
+                    <a:graphicData uri="http://schemas.openxmlformats.org/drawingml/2006/picture">
+                      <pic:pic xmlns:pic="http://schemas.openxmlformats.org/drawingml/2006/picture">
+                        <pic:nvPicPr>
+                          <pic:cNvPr id="810415773" name=""/>
+                          <pic:cNvPicPr/>
+                        </pic:nvPicPr>
+                        <pic:blipFill>
+                          <a:blip r:embed="rId30"/>
+                          <a:stretch>
+                            <a:fillRect/>
+                          </a:stretch>
+                        </pic:blipFill>
+                        <pic:spPr>
+                          <a:xfrm>
+                            <a:off x="0" y="0"/>
+                            <a:ext cx="5149949" cy="1447047"/>
+                          </a:xfrm>
+                          <a:prstGeom prst="rect">
+                            <a:avLst/>
+                          </a:prstGeom>
+                          <a:solidFill>
+                            <a:srgbClr val="FFFFFF">
+                              <a:shade val="85000"/>
+                            </a:srgbClr>
+                          </a:solidFill>
+                          <a:ln w="88900" cap="sq">
+                            <a:solidFill>
+                              <a:srgbClr val="FFFFFF"/>
+                            </a:solidFill>
+                            <a:miter lim="800000"/>
+                          </a:ln>
+                          <a:effectLst>
+                            <a:outerShdw blurRad="55000" dist="18000" dir="5400000" algn="tl" rotWithShape="0">
+                              <a:srgbClr val="000000">
+                                <a:alpha val="40000"/>
+                              </a:srgbClr>
+                            </a:outerShdw>
+                          </a:effectLst>
+                          <a:scene3d>
+                            <a:camera prst="orthographicFront"/>
+                            <a:lightRig rig="twoPt" dir="t">
+                              <a:rot lat="0" lon="0" rev="7200000"/>
+                            </a:lightRig>
+                          </a:scene3d>
+                          <a:sp3d>
+                            <a:bevelT w="25400" h="19050"/>
+                            <a:contourClr>
+                              <a:srgbClr val="FFFFFF"/>
+                            </a:contourClr>
+                          </a:sp3d>
+                        </pic:spPr>
+                      </pic:pic>
+                    </a:graphicData>
+                  </a:graphic>
+                </wp:inline>
+              </w:drawing>
+            </w:r>
+          </w:p>
+        </w:tc>
+      </w:tr>
+      <w:tr>
+        <w:tc>
+          <w:tcPr>
+            <w:tcW w:w="1784" w:type="dxa"/>
+          </w:tcPr>
+          <w:p>
+            <w:pPr>
+              <w:jc w:val="center"/>
+              <w:rPr>
+                <w:lang w:val="en-US"/>
+              </w:rPr>
+            </w:pPr>
+            <w:r>
+              <w:rPr>
+                <w:lang w:val="en-US"/>
+              </w:rPr>
+              <w:lastRenderedPageBreak/>
+              <w:t>18:45</w:t>
+            </w:r>
+          </w:p>
+        </w:tc>
+        <w:tc>
+          <w:tcPr>
+            <w:tcW w:w="2214" w:type="dxa"/>
+          </w:tcPr>
+          <w:p>
+            <w:pPr>
+              <w:rPr>
+                <w:lang w:val="en-US"/>
+              </w:rPr>
+            </w:pPr>
+            <w:proofErr w:type="spellStart"/>
+            <w:r>
+              <w:rPr>
+                <w:lang w:val="en-US"/>
+              </w:rPr>
+              <w:t>useMemo</w:t>
+            </w:r>
+            <w:proofErr w:type="spellEnd"/>
+          </w:p>
+        </w:tc>
+        <w:tc>
+          <w:tcPr>
+            <w:tcW w:w="2410" w:type="dxa"/>
+          </w:tcPr>
+          <w:p>
+            <w:pPr>
+              <w:rPr>
+                <w:lang w:val="en-GB"/>
+              </w:rPr>
+            </w:pPr>
+            <w:r>
+              <w:rPr>
+                <w:lang w:val="en-GB"/>
+              </w:rPr>
+              <w:t xml:space="preserve">Functions </w:t>
+            </w:r>
+            <w:proofErr w:type="spellStart"/>
+            <w:r>
+              <w:rPr>
+                <w:lang w:val="en-GB"/>
+              </w:rPr>
+              <w:t>ReRendering</w:t>
+            </w:r>
+            <w:proofErr w:type="spellEnd"/>
+            <w:r>
+              <w:rPr>
+                <w:lang w:val="en-GB"/>
+              </w:rPr>
+              <w:t xml:space="preserve"> Stoper – is for to stop </w:t>
+            </w:r>
+            <w:proofErr w:type="spellStart"/>
+            <w:r>
+              <w:rPr>
+                <w:lang w:val="en-GB"/>
+              </w:rPr>
+              <w:t>rerender</w:t>
+            </w:r>
+            <w:proofErr w:type="spellEnd"/>
+            <w:r>
+              <w:rPr>
+                <w:lang w:val="en-GB"/>
+              </w:rPr>
+              <w:t xml:space="preserve"> of the no </w:t>
+            </w:r>
+            <w:proofErr w:type="spellStart"/>
+            <w:r>
+              <w:rPr>
+                <w:lang w:val="en-GB"/>
+              </w:rPr>
+              <w:t>needet</w:t>
+            </w:r>
+            <w:proofErr w:type="spellEnd"/>
+            <w:r>
+              <w:rPr>
+                <w:lang w:val="en-GB"/>
+              </w:rPr>
+              <w:t xml:space="preserve"> for this time the functions</w:t>
+            </w:r>
+          </w:p>
+          <w:p>
+            <w:pPr>
+              <w:bidi/>
+              <w:rPr>
+                <w:lang w:val="en-US"/>
+              </w:rPr>
+            </w:pPr>
+            <w:r>
+              <w:rPr>
+                <w:rFonts w:hint="cs"/>
+                <w:rtl/>
+                <w:lang w:val="en-US"/>
+              </w:rPr>
+              <w:t xml:space="preserve">מיועד למניעת </w:t>
+            </w:r>
+            <w:proofErr w:type="spellStart"/>
+            <w:r>
+              <w:rPr>
+                <w:rFonts w:hint="cs"/>
+                <w:rtl/>
+                <w:lang w:val="en-US"/>
+              </w:rPr>
+              <w:t>רנדור</w:t>
+            </w:r>
+            <w:proofErr w:type="spellEnd"/>
+            <w:r>
+              <w:rPr>
+                <w:rFonts w:hint="cs"/>
+                <w:rtl/>
+                <w:lang w:val="en-US"/>
+              </w:rPr>
+              <w:t xml:space="preserve"> של מטודות הלא נדרשות לאותו רגע</w:t>
+            </w:r>
+          </w:p>
+        </w:tc>
+        <w:tc>
+          <w:tcPr>
+            <w:tcW w:w="8980" w:type="dxa"/>
+          </w:tcPr>
+          <w:p>
+            <w:pPr>
+              <w:jc w:val="center"/>
+              <w:rPr>
+                <w:rtl/>
+                <w:lang w:val="en-GB"/>
+              </w:rPr>
+            </w:pPr>
+            <w:r>
+              <w:rPr>
+                <w:noProof/>
+              </w:rPr>
+              <w:drawing>
+                <wp:inline distT="0" distB="0" distL="0" distR="0" wp14:anchorId="5D85632E" wp14:editId="5046E736">
+                  <wp:extent cx="4949105" cy="3299402"/>
+                  <wp:effectExtent l="114300" t="114300" r="137795" b="149225"/>
+                  <wp:docPr id="2065006015" name="Picture 1"/>
+                  <wp:cNvGraphicFramePr>
+                    <a:graphicFrameLocks xmlns:a="http://schemas.openxmlformats.org/drawingml/2006/main" noChangeAspect="1"/>
+                  </wp:cNvGraphicFramePr>
+                  <a:graphic xmlns:a="http://schemas.openxmlformats.org/drawingml/2006/main">
+                    <a:graphicData uri="http://schemas.openxmlformats.org/drawingml/2006/picture">
+                      <pic:pic xmlns:pic="http://schemas.openxmlformats.org/drawingml/2006/picture">
+                        <pic:nvPicPr>
+                          <pic:cNvPr id="2065006015" name=""/>
+                          <pic:cNvPicPr/>
+                        </pic:nvPicPr>
+                        <pic:blipFill>
+                          <a:blip r:embed="rId31"/>
+                          <a:stretch>
+                            <a:fillRect/>
+                          </a:stretch>
+                        </pic:blipFill>
+                        <pic:spPr>
+                          <a:xfrm>
+                            <a:off x="0" y="0"/>
+                            <a:ext cx="4964387" cy="3309590"/>
+                          </a:xfrm>
+                          <a:prstGeom prst="rect">
+                            <a:avLst/>
+                          </a:prstGeom>
+                          <a:solidFill>
+                            <a:srgbClr val="FFFFFF">
+                              <a:shade val="85000"/>
+                            </a:srgbClr>
+                          </a:solidFill>
+                          <a:ln w="88900" cap="sq">
+                            <a:solidFill>
+                              <a:srgbClr val="FFFFFF"/>
+                            </a:solidFill>
+                            <a:miter lim="800000"/>
+                          </a:ln>
+                          <a:effectLst>
+                            <a:outerShdw blurRad="55000" dist="18000" dir="5400000" algn="tl" rotWithShape="0">
+                              <a:srgbClr val="000000">
+                                <a:alpha val="40000"/>
+                              </a:srgbClr>
+                            </a:outerShdw>
+                          </a:effectLst>
+                          <a:scene3d>
+                            <a:camera prst="orthographicFront"/>
+                            <a:lightRig rig="twoPt" dir="t">
+                              <a:rot lat="0" lon="0" rev="7200000"/>
+                            </a:lightRig>
+                          </a:scene3d>
+                          <a:sp3d>
+                            <a:bevelT w="25400" h="19050"/>
+                            <a:contourClr>
+                              <a:srgbClr val="FFFFFF"/>
+                            </a:contourClr>
+                          </a:sp3d>
+                        </pic:spPr>
+                      </pic:pic>
+                    </a:graphicData>
+                  </a:graphic>
+                </wp:inline>
+              </w:drawing>
+            </w:r>
+          </w:p>
+        </w:tc>
+      </w:tr>
+      <w:tr>
+        <w:tc>
+          <w:tcPr>
+            <w:tcW w:w="1784" w:type="dxa"/>
+          </w:tcPr>
+          <w:p>
+            <w:pPr>
+              <w:jc w:val="center"/>
+              <w:rPr>
+                <w:lang w:val="en-US"/>
+              </w:rPr>
+            </w:pPr>
+            <w:r>
+              <w:rPr>
+                <w:rFonts w:hint="cs"/>
+                <w:rtl/>
+                <w:lang w:val="en-US"/>
+              </w:rPr>
+              <w:lastRenderedPageBreak/>
+              <w:t>18:55</w:t>
+            </w:r>
+          </w:p>
+        </w:tc>
+        <w:tc>
+          <w:tcPr>
+            <w:tcW w:w="2214" w:type="dxa"/>
+          </w:tcPr>
+          <w:p>
+            <w:pPr>
+              <w:rPr>
+                <w:lang w:val="en-GB"/>
+              </w:rPr>
+            </w:pPr>
+            <w:proofErr w:type="spellStart"/>
+            <w:r>
+              <w:rPr>
+                <w:lang w:val="en-GB"/>
+              </w:rPr>
+              <w:t>useCallBack</w:t>
+            </w:r>
+            <w:proofErr w:type="spellEnd"/>
+          </w:p>
+        </w:tc>
+        <w:tc>
+          <w:tcPr>
+            <w:tcW w:w="2410" w:type="dxa"/>
+          </w:tcPr>
+          <w:p>
+            <w:pPr>
+              <w:rPr>
+                <w:lang w:val="en-US"/>
+              </w:rPr>
+            </w:pPr>
+            <w:r>
+              <w:rPr>
+                <w:b/>
+                <w:bCs/>
+                <w:lang w:val="en-US"/>
+              </w:rPr>
+              <w:t>Situation</w:t>
+            </w:r>
+            <w:r>
+              <w:rPr>
+                <w:lang w:val="en-US"/>
+              </w:rPr>
+              <w:t>:</w:t>
+            </w:r>
+          </w:p>
+          <w:p>
+            <w:pPr>
+              <w:rPr>
+                <w:lang w:val="en-US"/>
+              </w:rPr>
+            </w:pPr>
+            <w:proofErr w:type="gramStart"/>
+            <w:r>
+              <w:rPr>
+                <w:lang w:val="en-US"/>
+              </w:rPr>
+              <w:t>Parent</w:t>
+            </w:r>
+            <w:proofErr w:type="gramEnd"/>
+            <w:r>
+              <w:rPr>
+                <w:lang w:val="en-US"/>
+              </w:rPr>
+              <w:t xml:space="preserve"> send the callback function to the child as prop.</w:t>
+            </w:r>
+          </w:p>
+          <w:p>
+            <w:pPr>
+              <w:rPr>
+                <w:lang w:val="en-US"/>
+              </w:rPr>
+            </w:pPr>
+            <w:r>
+              <w:rPr>
+                <w:b/>
+                <w:bCs/>
+                <w:lang w:val="en-US"/>
+              </w:rPr>
+              <w:t>Problem</w:t>
+            </w:r>
+            <w:r>
+              <w:rPr>
+                <w:lang w:val="en-US"/>
+              </w:rPr>
+              <w:t>:</w:t>
+            </w:r>
+          </w:p>
+          <w:p>
+            <w:pPr>
+              <w:rPr>
+                <w:lang w:val="en-US"/>
+              </w:rPr>
+            </w:pPr>
+            <w:r>
+              <w:rPr>
+                <w:lang w:val="en-US"/>
+              </w:rPr>
+              <w:t xml:space="preserve">Function </w:t>
+            </w:r>
+            <w:proofErr w:type="spellStart"/>
+            <w:r>
+              <w:rPr>
+                <w:lang w:val="en-US"/>
+              </w:rPr>
+              <w:t>rerenderend</w:t>
+            </w:r>
+            <w:proofErr w:type="spellEnd"/>
+            <w:r>
+              <w:rPr>
+                <w:lang w:val="en-US"/>
+              </w:rPr>
+              <w:t xml:space="preserve"> ever time the parent component </w:t>
+            </w:r>
+            <w:proofErr w:type="spellStart"/>
+            <w:r>
+              <w:rPr>
+                <w:lang w:val="en-US"/>
+              </w:rPr>
+              <w:t>rerendered</w:t>
+            </w:r>
+            <w:proofErr w:type="spellEnd"/>
+          </w:p>
+          <w:p>
+            <w:pPr>
+              <w:rPr>
+                <w:lang w:val="en-US"/>
+              </w:rPr>
+            </w:pPr>
+            <w:r>
+              <w:rPr>
+                <w:b/>
+                <w:bCs/>
+                <w:lang w:val="en-US"/>
+              </w:rPr>
+              <w:t>Solution</w:t>
+            </w:r>
+            <w:r>
+              <w:rPr>
+                <w:lang w:val="en-US"/>
+              </w:rPr>
+              <w:t>:</w:t>
+            </w:r>
+          </w:p>
+          <w:p>
+            <w:pPr>
+              <w:rPr>
+                <w:lang w:val="en-US"/>
+              </w:rPr>
+            </w:pPr>
+            <w:proofErr w:type="spellStart"/>
+            <w:proofErr w:type="gramStart"/>
+            <w:r>
+              <w:rPr>
+                <w:lang w:val="en-US"/>
+              </w:rPr>
+              <w:t>useCallback</w:t>
+            </w:r>
+            <w:proofErr w:type="spellEnd"/>
+            <w:r>
+              <w:rPr>
+                <w:lang w:val="en-US"/>
+              </w:rPr>
+              <w:t>(</w:t>
+            </w:r>
+            <w:proofErr w:type="gramEnd"/>
+            <w:r>
+              <w:rPr>
+                <w:lang w:val="en-US"/>
+              </w:rPr>
+              <w:t xml:space="preserve">) </w:t>
+            </w:r>
+          </w:p>
+          <w:p>
+            <w:pPr>
+              <w:rPr>
+                <w:rFonts w:hint="cs"/>
+                <w:rtl/>
+                <w:lang w:val="en-US"/>
+              </w:rPr>
+            </w:pPr>
+            <w:r>
+              <w:rPr>
+                <w:lang w:val="en-US"/>
+              </w:rPr>
+              <w:t xml:space="preserve">Save </w:t>
+            </w:r>
+            <w:proofErr w:type="gramStart"/>
+            <w:r>
+              <w:rPr>
+                <w:lang w:val="en-US"/>
+              </w:rPr>
+              <w:t>the  reference</w:t>
+            </w:r>
+            <w:proofErr w:type="gramEnd"/>
+            <w:r>
+              <w:rPr>
+                <w:lang w:val="en-US"/>
+              </w:rPr>
+              <w:t xml:space="preserve"> of the function without changes </w:t>
+            </w:r>
+          </w:p>
+          <w:p>
+            <w:pPr>
+              <w:rPr>
+                <w:lang w:val="en-US"/>
+              </w:rPr>
+            </w:pPr>
+          </w:p>
+        </w:tc>
+        <w:tc>
+          <w:tcPr>
+            <w:tcW w:w="8980" w:type="dxa"/>
+          </w:tcPr>
+          <w:p>
+            <w:pPr>
+              <w:jc w:val="center"/>
+              <w:rPr>
+                <w:b/>
+                <w:bCs/>
+                <w:lang w:val="en-GB"/>
+              </w:rPr>
+            </w:pPr>
+            <w:r>
+              <w:rPr>
+                <w:noProof/>
+              </w:rPr>
+              <w:drawing>
+                <wp:inline distT="0" distB="0" distL="0" distR="0" wp14:anchorId="2EB47E03" wp14:editId="352EEEB0">
+                  <wp:extent cx="4729596" cy="3115102"/>
+                  <wp:effectExtent l="114300" t="114300" r="109220" b="142875"/>
+                  <wp:docPr id="1477191709" name="Picture 1"/>
+                  <wp:cNvGraphicFramePr>
+                    <a:graphicFrameLocks xmlns:a="http://schemas.openxmlformats.org/drawingml/2006/main" noChangeAspect="1"/>
+                  </wp:cNvGraphicFramePr>
+                  <a:graphic xmlns:a="http://schemas.openxmlformats.org/drawingml/2006/main">
+                    <a:graphicData uri="http://schemas.openxmlformats.org/drawingml/2006/picture">
+                      <pic:pic xmlns:pic="http://schemas.openxmlformats.org/drawingml/2006/picture">
+                        <pic:nvPicPr>
+                          <pic:cNvPr id="1477191709" name=""/>
+                          <pic:cNvPicPr/>
+                        </pic:nvPicPr>
+                        <pic:blipFill>
+                          <a:blip r:embed="rId32"/>
+                          <a:stretch>
+                            <a:fillRect/>
+                          </a:stretch>
+                        </pic:blipFill>
+                        <pic:spPr>
+                          <a:xfrm>
+                            <a:off x="0" y="0"/>
+                            <a:ext cx="4737843" cy="3120534"/>
+                          </a:xfrm>
+                          <a:prstGeom prst="rect">
+                            <a:avLst/>
+                          </a:prstGeom>
+                          <a:solidFill>
+                            <a:srgbClr val="FFFFFF">
+                              <a:shade val="85000"/>
+                            </a:srgbClr>
+                          </a:solidFill>
+                          <a:ln w="88900" cap="sq">
+                            <a:solidFill>
+                              <a:srgbClr val="FFFFFF"/>
+                            </a:solidFill>
+                            <a:miter lim="800000"/>
+                          </a:ln>
+                          <a:effectLst>
+                            <a:outerShdw blurRad="55000" dist="18000" dir="5400000" algn="tl" rotWithShape="0">
+                              <a:srgbClr val="000000">
+                                <a:alpha val="40000"/>
+                              </a:srgbClr>
+                            </a:outerShdw>
+                          </a:effectLst>
+                          <a:scene3d>
+                            <a:camera prst="orthographicFront"/>
+                            <a:lightRig rig="twoPt" dir="t">
+                              <a:rot lat="0" lon="0" rev="7200000"/>
+                            </a:lightRig>
+                          </a:scene3d>
+                          <a:sp3d>
+                            <a:bevelT w="25400" h="19050"/>
+                            <a:contourClr>
+                              <a:srgbClr val="FFFFFF"/>
+                            </a:contourClr>
+                          </a:sp3d>
+                        </pic:spPr>
+                      </pic:pic>
+                    </a:graphicData>
+                  </a:graphic>
+                </wp:inline>
+              </w:drawing>
+            </w:r>
+          </w:p>
+        </w:tc>
+      </w:tr>
+      <w:tr>
+        <w:tc>
+          <w:tcPr>
+            <w:tcW w:w="1784" w:type="dxa"/>
+          </w:tcPr>
+          <w:p>
+            <w:pPr>
+              <w:jc w:val="center"/>
+              <w:rPr>
+                <w:rtl/>
+                <w:lang w:val="en-GB"/>
+              </w:rPr>
+            </w:pPr>
+            <w:r>
+              <w:rPr>
+                <w:lang w:val="en-GB"/>
+              </w:rPr>
+              <w:t>20:00</w:t>
+            </w:r>
+          </w:p>
+        </w:tc>
+        <w:tc>
+          <w:tcPr>
+            <w:tcW w:w="2214" w:type="dxa"/>
+          </w:tcPr>
+          <w:p>
+            <w:pPr>
+              <w:rPr>
+                <w:lang w:val="en-GB"/>
+              </w:rPr>
+            </w:pPr>
+            <w:r>
+              <w:rPr>
+                <w:lang w:val="en-GB"/>
+              </w:rPr>
+              <w:t xml:space="preserve">UI </w:t>
+            </w:r>
+          </w:p>
+        </w:tc>
+        <w:tc>
+          <w:tcPr>
+            <w:tcW w:w="2410" w:type="dxa"/>
+          </w:tcPr>
+          <w:p>
+            <w:pPr>
+              <w:rPr>
+                <w:lang w:val="en-US"/>
+              </w:rPr>
+            </w:pPr>
+            <w:proofErr w:type="spellStart"/>
+            <w:r>
+              <w:rPr>
+                <w:lang w:val="en-US"/>
+              </w:rPr>
+              <w:t>MaterialUI</w:t>
+            </w:r>
+            <w:proofErr w:type="spellEnd"/>
+            <w:r>
+              <w:rPr>
+                <w:lang w:val="en-US"/>
+              </w:rPr>
+              <w:t>:</w:t>
+            </w:r>
+          </w:p>
+          <w:p>
+            <w:pPr>
+              <w:rPr>
+                <w:lang w:val="en-US"/>
+              </w:rPr>
+            </w:pPr>
+            <w:r>
+              <w:rPr>
+                <w:lang w:val="en-US"/>
+              </w:rPr>
+              <w:t xml:space="preserve">To install -&gt; </w:t>
+            </w:r>
+          </w:p>
+          <w:p>
+            <w:pPr>
+              <w:rPr>
+                <w:i/>
+                <w:iCs/>
+                <w:lang w:val="en-US"/>
+              </w:rPr>
+            </w:pPr>
+            <w:proofErr w:type="spellStart"/>
+            <w:r>
+              <w:rPr>
+                <w:i/>
+                <w:iCs/>
+              </w:rPr>
+              <w:t>npm</w:t>
+            </w:r>
+            <w:proofErr w:type="spellEnd"/>
+            <w:r>
+              <w:rPr>
+                <w:i/>
+                <w:iCs/>
+              </w:rPr>
+              <w:t xml:space="preserve"> install @mui/material @emotion/react @emotion/styled</w:t>
+            </w:r>
+          </w:p>
+        </w:tc>
+        <w:tc>
+          <w:tcPr>
+            <w:tcW w:w="8980" w:type="dxa"/>
+          </w:tcPr>
+          <w:p>
+            <w:pPr>
+              <w:rPr>
+                <w:lang w:val="en-GB"/>
+              </w:rPr>
+            </w:pPr>
+          </w:p>
+        </w:tc>
+      </w:tr>
+      <w:tr>
+        <w:tc>
+          <w:tcPr>
+            <w:tcW w:w="1784" w:type="dxa"/>
+          </w:tcPr>
+          <w:p>
+            <w:pPr>
+              <w:jc w:val="center"/>
+              <w:rPr>
+                <w:lang w:val="en-GB"/>
+              </w:rPr>
+            </w:pPr>
+            <w:r>
+              <w:rPr>
+                <w:lang w:val="en-GB"/>
+              </w:rPr>
+              <w:lastRenderedPageBreak/>
+              <w:t>20:40</w:t>
+            </w:r>
+          </w:p>
+        </w:tc>
+        <w:tc>
+          <w:tcPr>
+            <w:tcW w:w="2214" w:type="dxa"/>
+          </w:tcPr>
+          <w:p>
+            <w:pPr>
+              <w:rPr>
+                <w:lang w:val="en-GB"/>
+              </w:rPr>
+            </w:pPr>
+            <w:r>
+              <w:rPr>
+                <w:lang w:val="en-GB"/>
+              </w:rPr>
+              <w:t>Hook</w:t>
+            </w:r>
+          </w:p>
+        </w:tc>
+        <w:tc>
+          <w:tcPr>
+            <w:tcW w:w="2410" w:type="dxa"/>
+          </w:tcPr>
+          <w:p>
+            <w:pPr>
+              <w:rPr>
+                <w:lang w:val="en-US"/>
+              </w:rPr>
+            </w:pPr>
+            <w:r>
+              <w:rPr>
+                <w:lang w:val="en-US"/>
+              </w:rPr>
+              <w:t xml:space="preserve">Functions like </w:t>
+            </w:r>
+            <w:proofErr w:type="gramStart"/>
+            <w:r>
+              <w:rPr>
+                <w:lang w:val="en-US"/>
+              </w:rPr>
+              <w:t>component</w:t>
+            </w:r>
+            <w:proofErr w:type="gramEnd"/>
+            <w:r>
+              <w:rPr>
+                <w:lang w:val="en-US"/>
+              </w:rPr>
+              <w:t xml:space="preserve"> without HTML returning, only information</w:t>
+            </w:r>
+          </w:p>
+        </w:tc>
+        <w:tc>
+          <w:tcPr>
+            <w:tcW w:w="8980" w:type="dxa"/>
+          </w:tcPr>
+          <w:p>
+            <w:pPr>
+              <w:jc w:val="center"/>
+              <w:rPr>
+                <w:lang w:val="en-GB"/>
+              </w:rPr>
+            </w:pPr>
+            <w:r>
+              <w:rPr>
+                <w:noProof/>
+              </w:rPr>
+              <w:drawing>
+                <wp:inline distT="0" distB="0" distL="0" distR="0" wp14:anchorId="5F212AAC" wp14:editId="725E29DF">
+                  <wp:extent cx="5590752" cy="3719945"/>
+                  <wp:effectExtent l="133350" t="114300" r="143510" b="166370"/>
+                  <wp:docPr id="2137751436" name="Picture 1"/>
+                  <wp:cNvGraphicFramePr>
+                    <a:graphicFrameLocks xmlns:a="http://schemas.openxmlformats.org/drawingml/2006/main" noChangeAspect="1"/>
+                  </wp:cNvGraphicFramePr>
+                  <a:graphic xmlns:a="http://schemas.openxmlformats.org/drawingml/2006/main">
+                    <a:graphicData uri="http://schemas.openxmlformats.org/drawingml/2006/picture">
+                      <pic:pic xmlns:pic="http://schemas.openxmlformats.org/drawingml/2006/picture">
+                        <pic:nvPicPr>
+                          <pic:cNvPr id="2137751436" name=""/>
+                          <pic:cNvPicPr/>
+                        </pic:nvPicPr>
+                        <pic:blipFill>
+                          <a:blip r:embed="rId33"/>
+                          <a:stretch>
+                            <a:fillRect/>
+                          </a:stretch>
+                        </pic:blipFill>
+                        <pic:spPr>
+                          <a:xfrm>
+                            <a:off x="0" y="0"/>
+                            <a:ext cx="5596750" cy="3723936"/>
+                          </a:xfrm>
+                          <a:prstGeom prst="rect">
+                            <a:avLst/>
+                          </a:prstGeom>
+                          <a:solidFill>
+                            <a:srgbClr val="FFFFFF">
+                              <a:shade val="85000"/>
+                            </a:srgbClr>
+                          </a:solidFill>
+                          <a:ln w="88900" cap="sq">
+                            <a:solidFill>
+                              <a:srgbClr val="FFFFFF"/>
+                            </a:solidFill>
+                            <a:miter lim="800000"/>
+                          </a:ln>
+                          <a:effectLst>
+                            <a:outerShdw blurRad="55000" dist="18000" dir="5400000" algn="tl" rotWithShape="0">
+                              <a:srgbClr val="000000">
+                                <a:alpha val="40000"/>
+                              </a:srgbClr>
+                            </a:outerShdw>
+                          </a:effectLst>
+                          <a:scene3d>
+                            <a:camera prst="orthographicFront"/>
+                            <a:lightRig rig="twoPt" dir="t">
+                              <a:rot lat="0" lon="0" rev="7200000"/>
+                            </a:lightRig>
+                          </a:scene3d>
+                          <a:sp3d>
+                            <a:bevelT w="25400" h="19050"/>
+                            <a:contourClr>
+                              <a:srgbClr val="FFFFFF"/>
+                            </a:contourClr>
+                          </a:sp3d>
+                        </pic:spPr>
+                      </pic:pic>
+                    </a:graphicData>
+                  </a:graphic>
+                </wp:inline>
+              </w:drawing>
+            </w:r>
+          </w:p>
+          <w:p>
+            <w:pPr>
+              <w:jc w:val="center"/>
+              <w:rPr>
+                <w:lang w:val="en-GB"/>
+              </w:rPr>
+            </w:pPr>
+            <w:r>
+              <w:rPr>
+                <w:noProof/>
+              </w:rPr>
+              <w:lastRenderedPageBreak/>
+              <w:drawing>
+                <wp:inline distT="0" distB="0" distL="0" distR="0" wp14:anchorId="3633FA5C" wp14:editId="5C2A18C8">
+                  <wp:extent cx="4960677" cy="3703571"/>
+                  <wp:effectExtent l="133350" t="114300" r="144780" b="163830"/>
+                  <wp:docPr id="2083064031" name="Picture 1"/>
+                  <wp:cNvGraphicFramePr>
+                    <a:graphicFrameLocks xmlns:a="http://schemas.openxmlformats.org/drawingml/2006/main" noChangeAspect="1"/>
+                  </wp:cNvGraphicFramePr>
+                  <a:graphic xmlns:a="http://schemas.openxmlformats.org/drawingml/2006/main">
+                    <a:graphicData uri="http://schemas.openxmlformats.org/drawingml/2006/picture">
+                      <pic:pic xmlns:pic="http://schemas.openxmlformats.org/drawingml/2006/picture">
+                        <pic:nvPicPr>
+                          <pic:cNvPr id="2083064031" name=""/>
+                          <pic:cNvPicPr/>
+                        </pic:nvPicPr>
+                        <pic:blipFill>
+                          <a:blip r:embed="rId34"/>
+                          <a:stretch>
+                            <a:fillRect/>
+                          </a:stretch>
+                        </pic:blipFill>
+                        <pic:spPr>
+                          <a:xfrm>
+                            <a:off x="0" y="0"/>
+                            <a:ext cx="4970855" cy="3711170"/>
+                          </a:xfrm>
+                          <a:prstGeom prst="rect">
+                            <a:avLst/>
+                          </a:prstGeom>
+                          <a:solidFill>
+                            <a:srgbClr val="FFFFFF">
+                              <a:shade val="85000"/>
+                            </a:srgbClr>
+                          </a:solidFill>
+                          <a:ln w="88900" cap="sq">
+                            <a:solidFill>
+                              <a:srgbClr val="FFFFFF"/>
+                            </a:solidFill>
+                            <a:miter lim="800000"/>
+                          </a:ln>
+                          <a:effectLst>
+                            <a:outerShdw blurRad="55000" dist="18000" dir="5400000" algn="tl" rotWithShape="0">
+                              <a:srgbClr val="000000">
+                                <a:alpha val="40000"/>
+                              </a:srgbClr>
+                            </a:outerShdw>
+                          </a:effectLst>
+                          <a:scene3d>
+                            <a:camera prst="orthographicFront"/>
+                            <a:lightRig rig="twoPt" dir="t">
+                              <a:rot lat="0" lon="0" rev="7200000"/>
+                            </a:lightRig>
+                          </a:scene3d>
+                          <a:sp3d>
+                            <a:bevelT w="25400" h="19050"/>
+                            <a:contourClr>
+                              <a:srgbClr val="FFFFFF"/>
+                            </a:contourClr>
+                          </a:sp3d>
+                        </pic:spPr>
+                      </pic:pic>
+                    </a:graphicData>
+                  </a:graphic>
+                </wp:inline>
+              </w:drawing>
+            </w:r>
+          </w:p>
+        </w:tc>
+      </w:tr>
+      <w:tr>
+        <w:tc>
+          <w:tcPr>
+            <w:tcW w:w="1784" w:type="dxa"/>
+          </w:tcPr>
+          <w:p>
+            <w:pPr>
+              <w:jc w:val="center"/>
+              <w:rPr>
+                <w:lang w:val="en-GB"/>
+              </w:rPr>
+            </w:pPr>
+          </w:p>
+        </w:tc>
+        <w:tc>
+          <w:tcPr>
+            <w:tcW w:w="2214" w:type="dxa"/>
+          </w:tcPr>
+          <w:p>
+            <w:pPr>
+              <w:rPr>
+                <w:lang w:val="en-GB"/>
+              </w:rPr>
+            </w:pPr>
+          </w:p>
+        </w:tc>
+        <w:tc>
+          <w:tcPr>
+            <w:tcW w:w="2410" w:type="dxa"/>
+          </w:tcPr>
+          <w:p>
+            <w:pPr>
+              <w:rPr>
+                <w:lang w:val="en-US"/>
+              </w:rPr>
+            </w:pPr>
+          </w:p>
+        </w:tc>
+        <w:tc>
+          <w:tcPr>
+            <w:tcW w:w="8980" w:type="dxa"/>
+          </w:tcPr>
+          <w:p>
+            <w:pPr>
+              <w:rPr>
+                <w:lang w:val="en-GB"/>
               </w:rPr>
             </w:pPr>
           </w:p>
@@ -7609,7 +8914,6 @@
   <w:style w:type="character" w:default="1" w:styleId="DefaultParagraphFont">
     <w:name w:val="Default Paragraph Font"/>
     <w:uiPriority w:val="1"/>
-    <w:semiHidden/>
     <w:unhideWhenUsed/>
   </w:style>
   <w:style w:type="table" w:default="1" w:styleId="TableNormal">

</xml_diff>